<commit_message>
feat: real API integration — all 3 languages working for CSV and DOCX
</commit_message>
<xml_diff>
--- a/samples/sample_nepali.docx
+++ b/samples/sample_nepali.docx
@@ -12,7 +12,7 @@
         <w:rPr>
           <w:rFonts w:hint="default"/>
         </w:rPr>
-        <w:t>[MOCK:ne] My name is Aaroshree.</w:t>
+        <w:t>मेरो नाम आरोश्री हो।</w:t>
       </w:r>
     </w:p>
     <w:p>
@@ -25,7 +25,7 @@
         <w:rPr>
           <w:rFonts w:hint="default"/>
         </w:rPr>
-        <w:t>[MOCK:ne] I am a student at Kathmandu University.</w:t>
+        <w:t>म काठमाडौँ विश्वविद्यालयको विद्यार्थी हुँ।</w:t>
       </w:r>
     </w:p>
     <w:p>
@@ -38,7 +38,7 @@
         <w:rPr>
           <w:rFonts w:hint="default"/>
         </w:rPr>
-        <w:t>[MOCK:ne] Nepal is a beautiful country.</w:t>
+        <w:t>नेपाल एउटा सुन्दर देश हो।</w:t>
       </w:r>
     </w:p>
     <w:p>
@@ -46,7 +46,7 @@
         <w:rPr>
           <w:rFonts w:hint="default"/>
         </w:rPr>
-        <w:t>[MOCK:ne] Welcome to TinBhasha.</w:t>
+        <w:t>तनभशामा स्वागत छ।</w:t>
       </w:r>
       <w:bookmarkStart w:id="0" w:name="_GoBack"/>
       <w:bookmarkEnd w:id="0"/>

</xml_diff>